<commit_message>
fix(visa-application): telex template — update year to 2026 and use ${...} placeholder
- Year «____» __________ 2024-yil → 2026-yil in the docx header
- {{applicants_list}} → \${applicants_list} so PhpWord TemplateProcessor
  can substitute the list of selected applicants correctly

https://claude.ai/code/session_015oGFtN7tqXX8dKgCy8BwAY
</commit_message>
<xml_diff>
--- a/resources/templates/visa/telex_template.docx
+++ b/resources/templates/visa/telex_template.docx
@@ -1468,7 +1468,7 @@
         <w:rPr>
           <w:lang w:val="en-US"/>
         </w:rPr>
-        <w:t>2024</w:t>
+        <w:t>2026</w:t>
       </w:r>
       <w:r>
         <w:rPr>
@@ -1957,7 +1957,7 @@
           <w:szCs w:val="28"/>
           <w:lang w:val="en-US"/>
         </w:rPr>
-        <w:t>{{applicants_list}}</w:t>
+        <w:t>${applicants_list}</w:t>
       </w:r>
     </w:p>
     <w:p>

</xml_diff>